<commit_message>
Zał. 1–4 dostosowane do finalnego zapytania (uwagi do formularza), Zał. 5 – formularz cenowy i płatności
Co-Authored-By: Claude Sonnet 5.5 <noreply@anthropic.com>
Claude-Session: https://claude.ai/code/session_014oD5P5yiRwT6Zb7b7udEcr
</commit_message>
<xml_diff>
--- a/zalaczniki_zapytanie_nr1/Zalacznik_2_Specyfikacja.docx
+++ b/zalaczniki_zapytanie_nr1/Zalacznik_2_Specyfikacja.docx
@@ -63,7 +63,6 @@
         <w:rPr>
           <w:rFonts w:ascii="Calibri" w:cs="Calibri" w:eastAsia="Calibri" w:hAnsi="Calibri"/>
           <w:highlight w:val="yellow"/>
-          <w:highlightCs w:val="yellow"/>
         </w:rPr>
         <w:t xml:space="preserve">[nazwa Wykonawcy]</w:t>
       </w:r>
@@ -610,7 +609,7 @@
                 <w:sz w:val="20"/>
                 <w:szCs w:val="20"/>
               </w:rPr>
-              <w:t xml:space="preserve">Stan fabryczny i data produkcji</w:t>
+              <w:t xml:space="preserve">Producent ładowarek – warunek z pkt 12 ppkt 2</w:t>
             </w:r>
           </w:p>
         </w:tc>
@@ -642,7 +641,7 @@
                 <w:sz w:val="20"/>
                 <w:szCs w:val="20"/>
               </w:rPr>
-              <w:t xml:space="preserve">Urządzenia fabrycznie nowe, nieużywane, wyprodukowane nie wcześniej niż 24 miesiące przed montażem. Wykonawca podaje datę produkcji.</w:t>
+              <w:t xml:space="preserve">Ładowarki pochodzą od producenta, który w okresie 3 lat poprzedzających upływ terminu składania ofert dostarczył i uruchomił łącznie co najmniej 100 stacjonarnych punktów ładowania DC o mocy ≥ 360 kW, co najmniej 5 niezależnym odbiorcom (w tym co najmniej jedna dostawa dla producenta pojazdów). Wykonawca dołącza oświadczenie producenta wraz z wykazem dostaw.</w:t>
             </w:r>
           </w:p>
         </w:tc>
@@ -756,7 +755,7 @@
                 <w:sz w:val="20"/>
                 <w:szCs w:val="20"/>
               </w:rPr>
-              <w:t xml:space="preserve">Architektura systemu</w:t>
+              <w:t xml:space="preserve">Stan fabryczny i data produkcji</w:t>
             </w:r>
           </w:p>
         </w:tc>
@@ -788,7 +787,7 @@
                 <w:sz w:val="20"/>
                 <w:szCs w:val="20"/>
               </w:rPr>
-              <w:t xml:space="preserve">Opis architektury technologicznej wraz ze schematem technologicznym. Preferowane: 3 jednostki przekształtnikowe 720 kW + 6 terminali 360 kW (każda jednostka współpracuje z dwoma terminalami); dopuszczone rozwiązania równoważne.</w:t>
+              <w:t xml:space="preserve">Urządzenia fabrycznie nowe, nieużywane, wyprodukowane nie wcześniej niż 24 miesiące przed montażem. Wykonawca podaje datę produkcji.</w:t>
             </w:r>
           </w:p>
         </w:tc>
@@ -902,7 +901,7 @@
                 <w:sz w:val="20"/>
                 <w:szCs w:val="20"/>
               </w:rPr>
-              <w:t xml:space="preserve">Liczba stacji ładowania (terminali)</w:t>
+              <w:t xml:space="preserve">Architektura systemu</w:t>
             </w:r>
           </w:p>
         </w:tc>
@@ -934,7 +933,7 @@
                 <w:sz w:val="20"/>
                 <w:szCs w:val="20"/>
               </w:rPr>
-              <w:t xml:space="preserve">6 szt., każda przypisana do odrębnego miejsca postojowego.</w:t>
+              <w:t xml:space="preserve">Opis architektury technologicznej wraz ze schematem technologicznym. Preferowane: 3 jednostki przekształtnikowe 720 kW + 6 terminali 360 kW (każda jednostka współpracuje z dwoma terminalami); dopuszczone rozwiązania równoważne.</w:t>
             </w:r>
           </w:p>
         </w:tc>
@@ -1048,7 +1047,7 @@
                 <w:sz w:val="20"/>
                 <w:szCs w:val="20"/>
               </w:rPr>
-              <w:t xml:space="preserve">Liczba punktów ładowania na stację</w:t>
+              <w:t xml:space="preserve">Liczba stacji ładowania (terminali)</w:t>
             </w:r>
           </w:p>
         </w:tc>
@@ -1080,7 +1079,7 @@
                 <w:sz w:val="20"/>
                 <w:szCs w:val="20"/>
               </w:rPr>
-              <w:t xml:space="preserve">1 punkt ładowania na każdą stację (łącznie 6 niezależnych punktów).</w:t>
+              <w:t xml:space="preserve">6 szt., każda przypisana do odrębnego miejsca postojowego.</w:t>
             </w:r>
           </w:p>
         </w:tc>
@@ -1194,7 +1193,7 @@
                 <w:sz w:val="20"/>
                 <w:szCs w:val="20"/>
               </w:rPr>
-              <w:t xml:space="preserve">Moc znamionowa punktu ładowania</w:t>
+              <w:t xml:space="preserve">Liczba punktów ładowania na stację</w:t>
             </w:r>
           </w:p>
         </w:tc>
@@ -1226,7 +1225,7 @@
                 <w:sz w:val="20"/>
                 <w:szCs w:val="20"/>
               </w:rPr>
-              <w:t xml:space="preserve">Co najmniej 360 kW, prąd stały (DC).</w:t>
+              <w:t xml:space="preserve">1 punkt ładowania na każdą stację (łącznie 6 niezależnych punktów).</w:t>
             </w:r>
           </w:p>
         </w:tc>
@@ -1340,7 +1339,7 @@
                 <w:sz w:val="20"/>
                 <w:szCs w:val="20"/>
               </w:rPr>
-              <w:t xml:space="preserve">Złącza i obsługiwane pojazdy</w:t>
+              <w:t xml:space="preserve">Moc znamionowa punktu ładowania</w:t>
             </w:r>
           </w:p>
         </w:tc>
@@ -1372,7 +1371,7 @@
                 <w:sz w:val="20"/>
                 <w:szCs w:val="20"/>
               </w:rPr>
-              <w:t xml:space="preserve">CCS2 / Combo 2 zgodne z normą EN 62196-3:2014; rozwiązania odpowiednie do obsługi pojazdów kat. N2/N3.</w:t>
+              <w:t xml:space="preserve">Co najmniej 360 kW, prąd stały (DC).</w:t>
             </w:r>
           </w:p>
         </w:tc>
@@ -1486,7 +1485,7 @@
                 <w:sz w:val="20"/>
                 <w:szCs w:val="20"/>
               </w:rPr>
-              <w:t xml:space="preserve">Liczba przewodów ładowania na terminal</w:t>
+              <w:t xml:space="preserve">Złącza i obsługiwane pojazdy</w:t>
             </w:r>
           </w:p>
         </w:tc>
@@ -1518,7 +1517,7 @@
                 <w:sz w:val="20"/>
                 <w:szCs w:val="20"/>
               </w:rPr>
-              <w:t xml:space="preserve">Co najmniej 1; preferowane 2 (drugi jako rezerwowy). W danej chwili ładować może wyłącznie jeden przewód z mocą wymaganą dla punktu; drugi przewód nie zwiększa liczby punktów.</w:t>
+              <w:t xml:space="preserve">CCS2 / Combo 2 zgodne z normą EN 62196-3:2014; rozwiązania odpowiednie do obsługi pojazdów kat. N2/N3.</w:t>
             </w:r>
           </w:p>
         </w:tc>
@@ -1632,7 +1631,7 @@
                 <w:sz w:val="20"/>
                 <w:szCs w:val="20"/>
               </w:rPr>
-              <w:t xml:space="preserve">Długość użytkowa przewodów ładowania</w:t>
+              <w:t xml:space="preserve">Liczba przewodów ładowania na terminal</w:t>
             </w:r>
           </w:p>
         </w:tc>
@@ -1664,7 +1663,7 @@
                 <w:sz w:val="20"/>
                 <w:szCs w:val="20"/>
               </w:rPr>
-              <w:t xml:space="preserve">Co najmniej 5 m.</w:t>
+              <w:t xml:space="preserve">Co najmniej 1; preferowane 2 (drugi jako rezerwowy). W danej chwili ładować może wyłącznie jeden przewód z mocą wymaganą dla punktu; drugi przewód nie zwiększa liczby punktów.</w:t>
             </w:r>
           </w:p>
         </w:tc>
@@ -1778,7 +1777,7 @@
                 <w:sz w:val="20"/>
                 <w:szCs w:val="20"/>
               </w:rPr>
-              <w:t xml:space="preserve">Jednostki przekształtnikowe – liczba i moc</w:t>
+              <w:t xml:space="preserve">Długość użytkowa przewodów ładowania</w:t>
             </w:r>
           </w:p>
         </w:tc>
@@ -1810,7 +1809,7 @@
                 <w:sz w:val="20"/>
                 <w:szCs w:val="20"/>
               </w:rPr>
-              <w:t xml:space="preserve">Wg oferowanej architektury (preferowane: 3 × 720 kW). Wykonawca podaje liczbę, moc i sposób współpracy z terminalami.</w:t>
+              <w:t xml:space="preserve">Co najmniej 5 m.</w:t>
             </w:r>
           </w:p>
         </w:tc>
@@ -1924,7 +1923,7 @@
                 <w:sz w:val="20"/>
                 <w:szCs w:val="20"/>
               </w:rPr>
-              <w:t xml:space="preserve">Możliwość niezależnego rozmieszczenia jednostek przekształtnikowych</w:t>
+              <w:t xml:space="preserve">Jednostki przekształtnikowe – liczba i moc</w:t>
             </w:r>
           </w:p>
         </w:tc>
@@ -1956,7 +1955,7 @@
                 <w:sz w:val="20"/>
                 <w:szCs w:val="20"/>
               </w:rPr>
-              <w:t xml:space="preserve">Preferowana. Wykonawca podaje TAK/NIE oraz maksymalną odległość jednostki od terminala.</w:t>
+              <w:t xml:space="preserve">Wg oferowanej architektury (preferowane: 3 × 720 kW). Wykonawca podaje liczbę, moc i sposób współpracy z terminalami.</w:t>
             </w:r>
           </w:p>
         </w:tc>
@@ -2070,7 +2069,7 @@
                 <w:sz w:val="20"/>
                 <w:szCs w:val="20"/>
               </w:rPr>
-              <w:t xml:space="preserve">Warunki pracy i przechowywania</w:t>
+              <w:t xml:space="preserve">Możliwość niezależnego rozmieszczenia jednostek przekształtnikowych</w:t>
             </w:r>
           </w:p>
         </w:tc>
@@ -2102,7 +2101,7 @@
                 <w:sz w:val="20"/>
                 <w:szCs w:val="20"/>
               </w:rPr>
-              <w:t xml:space="preserve">Temperatura pracy od −30°C do +50°C; temperatura przechowywania od −40°C do +70°C (parametry wg wniosku o dofinansowanie).</w:t>
+              <w:t xml:space="preserve">Preferowana. Wykonawca podaje TAK/NIE oraz maksymalną odległość jednostki od terminala.</w:t>
             </w:r>
           </w:p>
         </w:tc>
@@ -2216,7 +2215,7 @@
                 <w:sz w:val="20"/>
                 <w:szCs w:val="20"/>
               </w:rPr>
-              <w:t xml:space="preserve">Zgodność z normami</w:t>
+              <w:t xml:space="preserve">Warunki pracy i przechowywania</w:t>
             </w:r>
           </w:p>
         </w:tc>
@@ -2248,7 +2247,7 @@
                 <w:sz w:val="20"/>
                 <w:szCs w:val="20"/>
               </w:rPr>
-              <w:t xml:space="preserve">IEC 61851-1, IEC 61851-23, IEC 61851-24, oznakowanie CE oraz inne wynikające z przepisów. Wykonawca podaje wykaz zastosowanych norm.</w:t>
+              <w:t xml:space="preserve">Temperatura pracy od −30°C do +50°C; temperatura przechowywania od −40°C do +70°C (parametry wg wniosku o dofinansowanie).</w:t>
             </w:r>
           </w:p>
         </w:tc>
@@ -2304,6 +2303,152 @@
       <w:tr>
         <w:tc>
           <w:tcPr>
+            <w:tcW w:type="dxa" w:w="600"/>
+            <w:tcBorders>
+              <w:top w:val="single" w:color="808080" w:sz="4"/>
+              <w:left w:val="single" w:color="808080" w:sz="4"/>
+              <w:bottom w:val="single" w:color="808080" w:sz="4"/>
+              <w:right w:val="single" w:color="808080" w:sz="4"/>
+            </w:tcBorders>
+            <w:tcMar>
+              <w:top w:type="dxa" w:w="60"/>
+              <w:left w:type="dxa" w:w="90"/>
+              <w:bottom w:type="dxa" w:w="60"/>
+              <w:right w:type="dxa" w:w="90"/>
+            </w:tcMar>
+            <w:vAlign w:val="center"/>
+          </w:tcPr>
+          <w:p>
+            <w:pPr>
+              <w:spacing w:after="40" w:line="252"/>
+              <w:jc w:val="center"/>
+            </w:pPr>
+            <w:r>
+              <w:rPr>
+                <w:rFonts w:ascii="Calibri" w:cs="Calibri" w:eastAsia="Calibri" w:hAnsi="Calibri"/>
+                <w:sz w:val="20"/>
+                <w:szCs w:val="20"/>
+              </w:rPr>
+              <w:t xml:space="preserve">14</w:t>
+            </w:r>
+          </w:p>
+        </w:tc>
+        <w:tc>
+          <w:tcPr>
+            <w:tcW w:type="dxa" w:w="2700"/>
+            <w:tcBorders>
+              <w:top w:val="single" w:color="808080" w:sz="4"/>
+              <w:left w:val="single" w:color="808080" w:sz="4"/>
+              <w:bottom w:val="single" w:color="808080" w:sz="4"/>
+              <w:right w:val="single" w:color="808080" w:sz="4"/>
+            </w:tcBorders>
+            <w:tcMar>
+              <w:top w:type="dxa" w:w="60"/>
+              <w:left w:type="dxa" w:w="90"/>
+              <w:bottom w:type="dxa" w:w="60"/>
+              <w:right w:type="dxa" w:w="90"/>
+            </w:tcMar>
+            <w:vAlign w:val="center"/>
+          </w:tcPr>
+          <w:p>
+            <w:pPr>
+              <w:spacing w:after="40" w:line="252"/>
+              <w:jc w:val="left"/>
+            </w:pPr>
+            <w:r>
+              <w:rPr>
+                <w:rFonts w:ascii="Calibri" w:cs="Calibri" w:eastAsia="Calibri" w:hAnsi="Calibri"/>
+                <w:sz w:val="20"/>
+                <w:szCs w:val="20"/>
+              </w:rPr>
+              <w:t xml:space="preserve">Zgodność z normami</w:t>
+            </w:r>
+          </w:p>
+        </w:tc>
+        <w:tc>
+          <w:tcPr>
+            <w:tcW w:type="dxa" w:w="5100"/>
+            <w:tcBorders>
+              <w:top w:val="single" w:color="808080" w:sz="4"/>
+              <w:left w:val="single" w:color="808080" w:sz="4"/>
+              <w:bottom w:val="single" w:color="808080" w:sz="4"/>
+              <w:right w:val="single" w:color="808080" w:sz="4"/>
+            </w:tcBorders>
+            <w:tcMar>
+              <w:top w:type="dxa" w:w="60"/>
+              <w:left w:type="dxa" w:w="90"/>
+              <w:bottom w:type="dxa" w:w="60"/>
+              <w:right w:type="dxa" w:w="90"/>
+            </w:tcMar>
+            <w:vAlign w:val="center"/>
+          </w:tcPr>
+          <w:p>
+            <w:pPr>
+              <w:spacing w:after="40" w:line="252"/>
+              <w:jc w:val="left"/>
+            </w:pPr>
+            <w:r>
+              <w:rPr>
+                <w:rFonts w:ascii="Calibri" w:cs="Calibri" w:eastAsia="Calibri" w:hAnsi="Calibri"/>
+                <w:sz w:val="20"/>
+                <w:szCs w:val="20"/>
+              </w:rPr>
+              <w:t xml:space="preserve">IEC 61851-1, IEC 61851-23, IEC 61851-24, oznakowanie CE oraz inne wynikające z przepisów. Wykonawca podaje wykaz zastosowanych norm.</w:t>
+            </w:r>
+          </w:p>
+        </w:tc>
+        <w:tc>
+          <w:tcPr>
+            <w:tcW w:type="dxa" w:w="3700"/>
+            <w:tcBorders>
+              <w:top w:val="single" w:color="808080" w:sz="4"/>
+              <w:left w:val="single" w:color="808080" w:sz="4"/>
+              <w:bottom w:val="single" w:color="808080" w:sz="4"/>
+              <w:right w:val="single" w:color="808080" w:sz="4"/>
+            </w:tcBorders>
+            <w:tcMar>
+              <w:top w:type="dxa" w:w="60"/>
+              <w:left w:type="dxa" w:w="90"/>
+              <w:bottom w:type="dxa" w:w="60"/>
+              <w:right w:type="dxa" w:w="90"/>
+            </w:tcMar>
+            <w:vAlign w:val="center"/>
+          </w:tcPr>
+          <w:p>
+            <w:pPr>
+              <w:spacing w:after="40" w:line="252"/>
+              <w:jc w:val="left"/>
+            </w:pPr>
+          </w:p>
+        </w:tc>
+        <w:tc>
+          <w:tcPr>
+            <w:tcW w:type="dxa" w:w="2470"/>
+            <w:tcBorders>
+              <w:top w:val="single" w:color="808080" w:sz="4"/>
+              <w:left w:val="single" w:color="808080" w:sz="4"/>
+              <w:bottom w:val="single" w:color="808080" w:sz="4"/>
+              <w:right w:val="single" w:color="808080" w:sz="4"/>
+            </w:tcBorders>
+            <w:tcMar>
+              <w:top w:type="dxa" w:w="60"/>
+              <w:left w:type="dxa" w:w="90"/>
+              <w:bottom w:type="dxa" w:w="60"/>
+              <w:right w:type="dxa" w:w="90"/>
+            </w:tcMar>
+            <w:vAlign w:val="center"/>
+          </w:tcPr>
+          <w:p>
+            <w:pPr>
+              <w:spacing w:after="40" w:line="252"/>
+              <w:jc w:val="left"/>
+            </w:pPr>
+          </w:p>
+        </w:tc>
+      </w:tr>
+      <w:tr>
+        <w:tc>
+          <w:tcPr>
             <w:tcW w:type="dxa" w:w="14570"/>
             <w:gridSpan w:val="5"/>
             <w:tcBorders>
@@ -2366,7 +2511,7 @@
                 <w:sz w:val="20"/>
                 <w:szCs w:val="20"/>
               </w:rPr>
-              <w:t xml:space="preserve">14</w:t>
+              <w:t xml:space="preserve">15</w:t>
             </w:r>
           </w:p>
         </w:tc>
@@ -2512,7 +2657,7 @@
                 <w:sz w:val="20"/>
                 <w:szCs w:val="20"/>
               </w:rPr>
-              <w:t xml:space="preserve">15</w:t>
+              <w:t xml:space="preserve">16</w:t>
             </w:r>
           </w:p>
         </w:tc>
@@ -2658,7 +2803,7 @@
                 <w:sz w:val="20"/>
                 <w:szCs w:val="20"/>
               </w:rPr>
-              <w:t xml:space="preserve">16</w:t>
+              <w:t xml:space="preserve">17</w:t>
             </w:r>
           </w:p>
         </w:tc>
@@ -2804,7 +2949,7 @@
                 <w:sz w:val="20"/>
                 <w:szCs w:val="20"/>
               </w:rPr>
-              <w:t xml:space="preserve">17</w:t>
+              <w:t xml:space="preserve">18</w:t>
             </w:r>
           </w:p>
         </w:tc>
@@ -2950,7 +3095,7 @@
                 <w:sz w:val="20"/>
                 <w:szCs w:val="20"/>
               </w:rPr>
-              <w:t xml:space="preserve">18</w:t>
+              <w:t xml:space="preserve">19</w:t>
             </w:r>
           </w:p>
         </w:tc>
@@ -3096,7 +3241,7 @@
                 <w:sz w:val="20"/>
                 <w:szCs w:val="20"/>
               </w:rPr>
-              <w:t xml:space="preserve">19</w:t>
+              <w:t xml:space="preserve">20</w:t>
             </w:r>
           </w:p>
         </w:tc>
@@ -3242,7 +3387,7 @@
                 <w:sz w:val="20"/>
                 <w:szCs w:val="20"/>
               </w:rPr>
-              <w:t xml:space="preserve">20</w:t>
+              <w:t xml:space="preserve">21</w:t>
             </w:r>
           </w:p>
         </w:tc>
@@ -3388,7 +3533,7 @@
                 <w:sz w:val="20"/>
                 <w:szCs w:val="20"/>
               </w:rPr>
-              <w:t xml:space="preserve">21</w:t>
+              <w:t xml:space="preserve">22</w:t>
             </w:r>
           </w:p>
         </w:tc>
@@ -3534,7 +3679,7 @@
                 <w:sz w:val="20"/>
                 <w:szCs w:val="20"/>
               </w:rPr>
-              <w:t xml:space="preserve">22</w:t>
+              <w:t xml:space="preserve">23</w:t>
             </w:r>
           </w:p>
         </w:tc>
@@ -3680,7 +3825,7 @@
                 <w:sz w:val="20"/>
                 <w:szCs w:val="20"/>
               </w:rPr>
-              <w:t xml:space="preserve">23</w:t>
+              <w:t xml:space="preserve">24</w:t>
             </w:r>
           </w:p>
         </w:tc>
@@ -3862,7 +4007,7 @@
                 <w:sz w:val="20"/>
                 <w:szCs w:val="20"/>
               </w:rPr>
-              <w:t xml:space="preserve">24</w:t>
+              <w:t xml:space="preserve">25</w:t>
             </w:r>
           </w:p>
         </w:tc>
@@ -4008,7 +4153,7 @@
                 <w:sz w:val="20"/>
                 <w:szCs w:val="20"/>
               </w:rPr>
-              <w:t xml:space="preserve">25</w:t>
+              <w:t xml:space="preserve">26</w:t>
             </w:r>
           </w:p>
         </w:tc>
@@ -4154,7 +4299,7 @@
                 <w:sz w:val="20"/>
                 <w:szCs w:val="20"/>
               </w:rPr>
-              <w:t xml:space="preserve">26</w:t>
+              <w:t xml:space="preserve">27</w:t>
             </w:r>
           </w:p>
         </w:tc>
@@ -4300,7 +4445,7 @@
                 <w:sz w:val="20"/>
                 <w:szCs w:val="20"/>
               </w:rPr>
-              <w:t xml:space="preserve">27</w:t>
+              <w:t xml:space="preserve">28</w:t>
             </w:r>
           </w:p>
         </w:tc>
@@ -4446,7 +4591,7 @@
                 <w:sz w:val="20"/>
                 <w:szCs w:val="20"/>
               </w:rPr>
-              <w:t xml:space="preserve">28</w:t>
+              <w:t xml:space="preserve">29</w:t>
             </w:r>
           </w:p>
         </w:tc>
@@ -4592,7 +4737,7 @@
                 <w:sz w:val="20"/>
                 <w:szCs w:val="20"/>
               </w:rPr>
-              <w:t xml:space="preserve">29</w:t>
+              <w:t xml:space="preserve">30</w:t>
             </w:r>
           </w:p>
         </w:tc>
@@ -4738,7 +4883,7 @@
                 <w:sz w:val="20"/>
                 <w:szCs w:val="20"/>
               </w:rPr>
-              <w:t xml:space="preserve">30</w:t>
+              <w:t xml:space="preserve">31</w:t>
             </w:r>
           </w:p>
         </w:tc>
@@ -4920,7 +5065,7 @@
                 <w:sz w:val="20"/>
                 <w:szCs w:val="20"/>
               </w:rPr>
-              <w:t xml:space="preserve">31</w:t>
+              <w:t xml:space="preserve">32</w:t>
             </w:r>
           </w:p>
         </w:tc>
@@ -5066,7 +5211,7 @@
                 <w:sz w:val="20"/>
                 <w:szCs w:val="20"/>
               </w:rPr>
-              <w:t xml:space="preserve">32</w:t>
+              <w:t xml:space="preserve">33</w:t>
             </w:r>
           </w:p>
         </w:tc>
@@ -5212,7 +5357,7 @@
                 <w:sz w:val="20"/>
                 <w:szCs w:val="20"/>
               </w:rPr>
-              <w:t xml:space="preserve">33</w:t>
+              <w:t xml:space="preserve">34</w:t>
             </w:r>
           </w:p>
         </w:tc>
@@ -5358,7 +5503,7 @@
                 <w:sz w:val="20"/>
                 <w:szCs w:val="20"/>
               </w:rPr>
-              <w:t xml:space="preserve">34</w:t>
+              <w:t xml:space="preserve">35</w:t>
             </w:r>
           </w:p>
         </w:tc>
@@ -5504,7 +5649,7 @@
                 <w:sz w:val="20"/>
                 <w:szCs w:val="20"/>
               </w:rPr>
-              <w:t xml:space="preserve">35</w:t>
+              <w:t xml:space="preserve">36</w:t>
             </w:r>
           </w:p>
         </w:tc>
@@ -5650,7 +5795,7 @@
                 <w:sz w:val="20"/>
                 <w:szCs w:val="20"/>
               </w:rPr>
-              <w:t xml:space="preserve">36</w:t>
+              <w:t xml:space="preserve">37</w:t>
             </w:r>
           </w:p>
         </w:tc>
@@ -5796,7 +5941,7 @@
                 <w:sz w:val="20"/>
                 <w:szCs w:val="20"/>
               </w:rPr>
-              <w:t xml:space="preserve">37</w:t>
+              <w:t xml:space="preserve">38</w:t>
             </w:r>
           </w:p>
         </w:tc>
@@ -5942,7 +6087,7 @@
                 <w:sz w:val="20"/>
                 <w:szCs w:val="20"/>
               </w:rPr>
-              <w:t xml:space="preserve">38</w:t>
+              <w:t xml:space="preserve">39</w:t>
             </w:r>
           </w:p>
         </w:tc>
@@ -6088,7 +6233,7 @@
                 <w:sz w:val="20"/>
                 <w:szCs w:val="20"/>
               </w:rPr>
-              <w:t xml:space="preserve">39</w:t>
+              <w:t xml:space="preserve">40</w:t>
             </w:r>
           </w:p>
         </w:tc>
@@ -6234,7 +6379,7 @@
                 <w:sz w:val="20"/>
                 <w:szCs w:val="20"/>
               </w:rPr>
-              <w:t xml:space="preserve">40</w:t>
+              <w:t xml:space="preserve">41</w:t>
             </w:r>
           </w:p>
         </w:tc>
@@ -6380,7 +6525,7 @@
                 <w:sz w:val="20"/>
                 <w:szCs w:val="20"/>
               </w:rPr>
-              <w:t xml:space="preserve">41</w:t>
+              <w:t xml:space="preserve">42</w:t>
             </w:r>
           </w:p>
         </w:tc>
@@ -6526,7 +6671,7 @@
                 <w:sz w:val="20"/>
                 <w:szCs w:val="20"/>
               </w:rPr>
-              <w:t xml:space="preserve">42</w:t>
+              <w:t xml:space="preserve">43</w:t>
             </w:r>
           </w:p>
         </w:tc>
@@ -6672,7 +6817,7 @@
                 <w:sz w:val="20"/>
                 <w:szCs w:val="20"/>
               </w:rPr>
-              <w:t xml:space="preserve">43</w:t>
+              <w:t xml:space="preserve">44</w:t>
             </w:r>
           </w:p>
         </w:tc>
@@ -6818,7 +6963,7 @@
                 <w:sz w:val="20"/>
                 <w:szCs w:val="20"/>
               </w:rPr>
-              <w:t xml:space="preserve">44</w:t>
+              <w:t xml:space="preserve">45</w:t>
             </w:r>
           </w:p>
         </w:tc>
@@ -6964,7 +7109,7 @@
                 <w:sz w:val="20"/>
                 <w:szCs w:val="20"/>
               </w:rPr>
-              <w:t xml:space="preserve">45</w:t>
+              <w:t xml:space="preserve">46</w:t>
             </w:r>
           </w:p>
         </w:tc>
@@ -7110,7 +7255,7 @@
                 <w:sz w:val="20"/>
                 <w:szCs w:val="20"/>
               </w:rPr>
-              <w:t xml:space="preserve">46</w:t>
+              <w:t xml:space="preserve">47</w:t>
             </w:r>
           </w:p>
         </w:tc>
@@ -7256,7 +7401,7 @@
                 <w:sz w:val="20"/>
                 <w:szCs w:val="20"/>
               </w:rPr>
-              <w:t xml:space="preserve">47</w:t>
+              <w:t xml:space="preserve">48</w:t>
             </w:r>
           </w:p>
         </w:tc>
@@ -7402,7 +7547,7 @@
                 <w:sz w:val="20"/>
                 <w:szCs w:val="20"/>
               </w:rPr>
-              <w:t xml:space="preserve">48</w:t>
+              <w:t xml:space="preserve">49</w:t>
             </w:r>
           </w:p>
         </w:tc>
@@ -7548,7 +7693,7 @@
                 <w:sz w:val="20"/>
                 <w:szCs w:val="20"/>
               </w:rPr>
-              <w:t xml:space="preserve">49</w:t>
+              <w:t xml:space="preserve">50</w:t>
             </w:r>
           </w:p>
         </w:tc>
@@ -7730,7 +7875,7 @@
                 <w:sz w:val="20"/>
                 <w:szCs w:val="20"/>
               </w:rPr>
-              <w:t xml:space="preserve">50</w:t>
+              <w:t xml:space="preserve">51</w:t>
             </w:r>
           </w:p>
         </w:tc>
@@ -7876,7 +8021,7 @@
                 <w:sz w:val="20"/>
                 <w:szCs w:val="20"/>
               </w:rPr>
-              <w:t xml:space="preserve">51</w:t>
+              <w:t xml:space="preserve">52</w:t>
             </w:r>
           </w:p>
         </w:tc>
@@ -8022,7 +8167,7 @@
                 <w:sz w:val="20"/>
                 <w:szCs w:val="20"/>
               </w:rPr>
-              <w:t xml:space="preserve">52</w:t>
+              <w:t xml:space="preserve">53</w:t>
             </w:r>
           </w:p>
         </w:tc>
@@ -8168,7 +8313,7 @@
                 <w:sz w:val="20"/>
                 <w:szCs w:val="20"/>
               </w:rPr>
-              <w:t xml:space="preserve">53</w:t>
+              <w:t xml:space="preserve">54</w:t>
             </w:r>
           </w:p>
         </w:tc>
@@ -8314,7 +8459,7 @@
                 <w:sz w:val="20"/>
                 <w:szCs w:val="20"/>
               </w:rPr>
-              <w:t xml:space="preserve">54</w:t>
+              <w:t xml:space="preserve">55</w:t>
             </w:r>
           </w:p>
         </w:tc>
@@ -8460,7 +8605,7 @@
                 <w:sz w:val="20"/>
                 <w:szCs w:val="20"/>
               </w:rPr>
-              <w:t xml:space="preserve">55</w:t>
+              <w:t xml:space="preserve">56</w:t>
             </w:r>
           </w:p>
         </w:tc>
@@ -8642,7 +8787,7 @@
                 <w:sz w:val="20"/>
                 <w:szCs w:val="20"/>
               </w:rPr>
-              <w:t xml:space="preserve">56</w:t>
+              <w:t xml:space="preserve">57</w:t>
             </w:r>
           </w:p>
         </w:tc>

</xml_diff>